<commit_message>
docs: koreksi notulensi rakor 1 KKM Jabo + riset biaya hidup
Claude-Session: https://claude.ai/code/session_018J9LLHb8TC2ueufMcfeumC
</commit_message>
<xml_diff>
--- a/docs/kkm/ringkasan rakor 1 kkm jabo.docx
+++ b/docs/kkm/ringkasan rakor 1 kkm jabo.docx
@@ -74,7 +74,7 @@
           </w:p>
           <w:p>
             <w:r>
-              <w:t>•  Kandidat DPL: Pak Afta (TI, diskusi Senin) &amp; Bu Nita (Perpustakaan, punya orang tua di Tangerang).</w:t>
+              <w:t>•  Kandidat DPL: Pak Okta (TI, diskusi Senin) &amp; Bu Nita (Kaprodi Perpustakaan, orang tua di Tangerang).</w:t>
             </w:r>
           </w:p>
           <w:p>
@@ -463,7 +463,7 @@
               <w:rPr>
                 <w:sz w:val="20"/>
               </w:rPr>
-              <w:t>Sye</w:t>
+              <w:t>Syekh</w:t>
             </w:r>
           </w:p>
         </w:tc>
@@ -478,6 +478,126 @@
                 <w:sz w:val="20"/>
               </w:rPr>
               <w:t>— Aceh</w:t>
+            </w:r>
+          </w:p>
+        </w:tc>
+      </w:tr>
+      <w:tr>
+        <w:tc>
+          <w:tcPr>
+            <w:tcW w:type="dxa" w:w="3969"/>
+          </w:tcPr>
+          <w:p>
+            <w:r/>
+            <w:r>
+              <w:rPr>
+                <w:sz w:val="20"/>
+              </w:rPr>
+              <w:t>Gilang</w:t>
+            </w:r>
+          </w:p>
+        </w:tc>
+        <w:tc>
+          <w:tcPr>
+            <w:tcW w:type="dxa" w:w="5102"/>
+          </w:tcPr>
+          <w:p>
+            <w:r/>
+            <w:r>
+              <w:rPr>
+                <w:sz w:val="20"/>
+              </w:rPr>
+              <w:t>Perbankan Syariah (PBS)</w:t>
+            </w:r>
+          </w:p>
+        </w:tc>
+      </w:tr>
+      <w:tr>
+        <w:tc>
+          <w:tcPr>
+            <w:tcW w:type="dxa" w:w="3969"/>
+          </w:tcPr>
+          <w:p>
+            <w:r/>
+            <w:r>
+              <w:rPr>
+                <w:sz w:val="20"/>
+              </w:rPr>
+              <w:t>Bagas</w:t>
+            </w:r>
+          </w:p>
+        </w:tc>
+        <w:tc>
+          <w:tcPr>
+            <w:tcW w:type="dxa" w:w="5102"/>
+          </w:tcPr>
+          <w:p>
+            <w:r/>
+            <w:r>
+              <w:rPr>
+                <w:sz w:val="20"/>
+              </w:rPr>
+              <w:t>Teknik Informatika</w:t>
+            </w:r>
+          </w:p>
+        </w:tc>
+      </w:tr>
+      <w:tr>
+        <w:tc>
+          <w:tcPr>
+            <w:tcW w:type="dxa" w:w="3969"/>
+          </w:tcPr>
+          <w:p>
+            <w:r/>
+            <w:r>
+              <w:rPr>
+                <w:sz w:val="20"/>
+              </w:rPr>
+              <w:t>Khrisna</w:t>
+            </w:r>
+          </w:p>
+        </w:tc>
+        <w:tc>
+          <w:tcPr>
+            <w:tcW w:type="dxa" w:w="5102"/>
+          </w:tcPr>
+          <w:p>
+            <w:r/>
+            <w:r>
+              <w:rPr>
+                <w:sz w:val="20"/>
+              </w:rPr>
+              <w:t>Teknik Arsitektur</w:t>
+            </w:r>
+          </w:p>
+        </w:tc>
+      </w:tr>
+      <w:tr>
+        <w:tc>
+          <w:tcPr>
+            <w:tcW w:type="dxa" w:w="3969"/>
+          </w:tcPr>
+          <w:p>
+            <w:r/>
+            <w:r>
+              <w:rPr>
+                <w:sz w:val="20"/>
+              </w:rPr>
+              <w:t>Zakky</w:t>
+            </w:r>
+          </w:p>
+        </w:tc>
+        <w:tc>
+          <w:tcPr>
+            <w:tcW w:type="dxa" w:w="5102"/>
+          </w:tcPr>
+          <w:p>
+            <w:r/>
+            <w:r>
+              <w:rPr>
+                <w:sz w:val="20"/>
+              </w:rPr>
+              <w:t>— Solo</w:t>
             </w:r>
           </w:p>
         </w:tc>
@@ -538,36 +658,6 @@
                 <w:sz w:val="20"/>
               </w:rPr>
               <w:t>Teknik Informatika — Mojokerto</w:t>
-            </w:r>
-          </w:p>
-        </w:tc>
-      </w:tr>
-      <w:tr>
-        <w:tc>
-          <w:tcPr>
-            <w:tcW w:type="dxa" w:w="3969"/>
-          </w:tcPr>
-          <w:p>
-            <w:r/>
-            <w:r>
-              <w:rPr>
-                <w:sz w:val="20"/>
-              </w:rPr>
-              <w:t>(Cekanyar)</w:t>
-            </w:r>
-          </w:p>
-        </w:tc>
-        <w:tc>
-          <w:tcPr>
-            <w:tcW w:type="dxa" w:w="5102"/>
-          </w:tcPr>
-          <w:p>
-            <w:r/>
-            <w:r>
-              <w:rPr>
-                <w:sz w:val="20"/>
-              </w:rPr>
-              <w:t>— Solo</w:t>
             </w:r>
           </w:p>
         </w:tc>
@@ -973,7 +1063,7 @@
               <w:rPr>
                 <w:sz w:val="20"/>
               </w:rPr>
-              <w:t>—</w:t>
+              <w:t>Belum ada DPL</w:t>
             </w:r>
           </w:p>
         </w:tc>
@@ -987,7 +1077,7 @@
               <w:rPr>
                 <w:sz w:val="20"/>
               </w:rPr>
-              <w:t>Lebih panas, banyak pabrik (tapi desa jauh dari pabrik)</w:t>
+              <w:t>Belum ada DPL; lebih panas, banyak pabrik (desa jauh dari pabrik)</w:t>
             </w:r>
           </w:p>
         </w:tc>
@@ -1001,7 +1091,7 @@
               <w:rPr>
                 <w:sz w:val="20"/>
               </w:rPr>
-              <w:t>Belum ada lokasi &amp; kontak desa</w:t>
+              <w:t>Belum ada lokasi (DPL calon: Bu Nita)</w:t>
             </w:r>
           </w:p>
         </w:tc>
@@ -1029,7 +1119,7 @@
         <w:pStyle w:val="ListBullet"/>
       </w:pPr>
       <w:r>
-        <w:t>Kendala mobilitas: motor anggota mayoritas di Malang. Kendaraan lokal terbatas (Adam: 1 motor + 1 mobil hatchback, tidak cukup untuk 10–15 orang).</w:t>
+        <w:t>Kendala mobilitas: motor anggota mayoritas di Malang. Kendaraan yang tersedia di Jabo/Jabar (dari beberapa anggota, termasuk Raditya 1 mobil + 1 motor): total ± 2 mobil + 4 motor — perlu diatur pemakaiannya untuk 13–15 orang.</w:t>
       </w:r>
     </w:p>
     <w:p>
@@ -1260,7 +1350,7 @@
               <w:rPr>
                 <w:sz w:val="20"/>
               </w:rPr>
-              <w:t>Pak Afta</w:t>
+              <w:t>Pak Okta</w:t>
             </w:r>
           </w:p>
         </w:tc>
@@ -1319,7 +1409,7 @@
               <w:rPr>
                 <w:sz w:val="20"/>
               </w:rPr>
-              <w:t>Perpustakaan (Saintek)</w:t>
+              <w:t>Kaprodi Perpustakaan</w:t>
             </w:r>
           </w:p>
         </w:tc>
@@ -1334,7 +1424,7 @@
               <w:rPr>
                 <w:sz w:val="20"/>
               </w:rPr>
-              <w:t>🟡 Bersedia, fast respon; terkendala jarak &amp; anak kecil, tapi orang tua di Tangerang (bisa sekalian pulang kampung)</w:t>
+              <w:t>🟡 Bersedia &amp; fast respon. Terkendala jarak karena memiliki anak yang masih kecil sehingga tidak bisa ditinggal jauh; namun orang tuanya di Tangerang, jadi lokasi Tangerang memungkinkan (sekalian pulang kampung)</w:t>
             </w:r>
           </w:p>
         </w:tc>
@@ -2185,7 +2275,569 @@
         <w:rPr>
           <w:color w:val="1F3A5F"/>
         </w:rPr>
-        <w:t>Biaya hidup di lokasi</w:t>
+        <w:t>Biaya hidup di lokasi (hasil riset)</w:t>
+      </w:r>
+    </w:p>
+    <w:p>
+      <w:r>
+        <w:rPr>
+          <w:i w:val="0"/>
+        </w:rPr>
+        <w:t>Indikator: UMK 2025 Kab. Karawang ± Rp5,6 juta (salah satu tertinggi nasional) dan Kab. Bogor ± Rp4,9 juta, jauh di atas Kota Malang (± Rp3,5 juta) → harga makanan jadi/jajan umumnya lebih mahal dari Malang. Harga bahan pokok relatif mirip karena mengacu harga nasional.</w:t>
+      </w:r>
+    </w:p>
+    <w:tbl>
+      <w:tblPr>
+        <w:tblStyle w:val="TableGrid"/>
+        <w:tblW w:type="auto" w:w="0"/>
+        <w:jc w:val="center"/>
+        <w:tblLook w:firstColumn="1" w:firstRow="1" w:lastColumn="0" w:lastRow="0" w:noHBand="0" w:noVBand="1" w:val="04A0"/>
+      </w:tblPr>
+      <w:tblGrid>
+        <w:gridCol w:w="3249"/>
+        <w:gridCol w:w="3249"/>
+        <w:gridCol w:w="3249"/>
+      </w:tblGrid>
+      <w:tr>
+        <w:tc>
+          <w:tcPr>
+            <w:tcW w:type="dxa" w:w="2551"/>
+            <w:shd w:val="clear" w:color="auto" w:fill="1F3A5F"/>
+          </w:tcPr>
+          <w:p>
+            <w:r/>
+            <w:r>
+              <w:rPr>
+                <w:b/>
+                <w:color w:val="FFFFFF"/>
+                <w:sz w:val="20"/>
+              </w:rPr>
+              <w:t>Item</w:t>
+            </w:r>
+          </w:p>
+        </w:tc>
+        <w:tc>
+          <w:tcPr>
+            <w:tcW w:type="dxa" w:w="2835"/>
+            <w:shd w:val="clear" w:color="auto" w:fill="1F3A5F"/>
+          </w:tcPr>
+          <w:p>
+            <w:r/>
+            <w:r>
+              <w:rPr>
+                <w:b/>
+                <w:color w:val="FFFFFF"/>
+                <w:sz w:val="20"/>
+              </w:rPr>
+              <w:t>Perkiraan Harga</w:t>
+            </w:r>
+          </w:p>
+        </w:tc>
+        <w:tc>
+          <w:tcPr>
+            <w:tcW w:type="dxa" w:w="3685"/>
+            <w:shd w:val="clear" w:color="auto" w:fill="1F3A5F"/>
+          </w:tcPr>
+          <w:p>
+            <w:r/>
+            <w:r>
+              <w:rPr>
+                <w:b/>
+                <w:color w:val="FFFFFF"/>
+                <w:sz w:val="20"/>
+              </w:rPr>
+              <w:t>Catatan</w:t>
+            </w:r>
+          </w:p>
+        </w:tc>
+      </w:tr>
+      <w:tr>
+        <w:tc>
+          <w:tcPr>
+            <w:tcW w:type="dxa" w:w="2551"/>
+          </w:tcPr>
+          <w:p>
+            <w:r/>
+            <w:r>
+              <w:rPr>
+                <w:sz w:val="20"/>
+              </w:rPr>
+              <w:t>Beras medium / premium</w:t>
+            </w:r>
+          </w:p>
+        </w:tc>
+        <w:tc>
+          <w:tcPr>
+            <w:tcW w:type="dxa" w:w="2835"/>
+          </w:tcPr>
+          <w:p>
+            <w:r/>
+            <w:r>
+              <w:rPr>
+                <w:sz w:val="20"/>
+              </w:rPr>
+              <w:t>Rp13.500 / Rp15.400 per kg</w:t>
+            </w:r>
+          </w:p>
+        </w:tc>
+        <w:tc>
+          <w:tcPr>
+            <w:tcW w:type="dxa" w:w="3685"/>
+          </w:tcPr>
+          <w:p>
+            <w:r/>
+            <w:r>
+              <w:rPr>
+                <w:sz w:val="20"/>
+              </w:rPr>
+              <w:t>Data Bapanas Feb 2026</w:t>
+            </w:r>
+          </w:p>
+        </w:tc>
+      </w:tr>
+      <w:tr>
+        <w:tc>
+          <w:tcPr>
+            <w:tcW w:type="dxa" w:w="2551"/>
+          </w:tcPr>
+          <w:p>
+            <w:r/>
+            <w:r>
+              <w:rPr>
+                <w:sz w:val="20"/>
+              </w:rPr>
+              <w:t>Telur ayam</w:t>
+            </w:r>
+          </w:p>
+        </w:tc>
+        <w:tc>
+          <w:tcPr>
+            <w:tcW w:type="dxa" w:w="2835"/>
+          </w:tcPr>
+          <w:p>
+            <w:r/>
+            <w:r>
+              <w:rPr>
+                <w:sz w:val="20"/>
+              </w:rPr>
+              <w:t>Rp29.000 – 35.000 per kg</w:t>
+            </w:r>
+          </w:p>
+        </w:tc>
+        <w:tc>
+          <w:tcPr>
+            <w:tcW w:type="dxa" w:w="3685"/>
+          </w:tcPr>
+          <w:p>
+            <w:r/>
+            <w:r>
+              <w:rPr>
+                <w:sz w:val="20"/>
+              </w:rPr>
+              <w:t>Fluktuatif (PIHPS Jul–Agu 2026)</w:t>
+            </w:r>
+          </w:p>
+        </w:tc>
+      </w:tr>
+      <w:tr>
+        <w:tc>
+          <w:tcPr>
+            <w:tcW w:type="dxa" w:w="2551"/>
+          </w:tcPr>
+          <w:p>
+            <w:r/>
+            <w:r>
+              <w:rPr>
+                <w:sz w:val="20"/>
+              </w:rPr>
+              <w:t>Daging ayam</w:t>
+            </w:r>
+          </w:p>
+        </w:tc>
+        <w:tc>
+          <w:tcPr>
+            <w:tcW w:type="dxa" w:w="2835"/>
+          </w:tcPr>
+          <w:p>
+            <w:r/>
+            <w:r>
+              <w:rPr>
+                <w:sz w:val="20"/>
+              </w:rPr>
+              <w:t>± Rp40.000 per kg</w:t>
+            </w:r>
+          </w:p>
+        </w:tc>
+        <w:tc>
+          <w:tcPr>
+            <w:tcW w:type="dxa" w:w="3685"/>
+          </w:tcPr>
+          <w:p>
+            <w:r/>
+            <w:r>
+              <w:rPr>
+                <w:sz w:val="20"/>
+              </w:rPr>
+              <w:t>Pantauan pasar Kota Bogor</w:t>
+            </w:r>
+          </w:p>
+        </w:tc>
+      </w:tr>
+      <w:tr>
+        <w:tc>
+          <w:tcPr>
+            <w:tcW w:type="dxa" w:w="2551"/>
+          </w:tcPr>
+          <w:p>
+            <w:r/>
+            <w:r>
+              <w:rPr>
+                <w:sz w:val="20"/>
+              </w:rPr>
+              <w:t>Makan warteg / warung</w:t>
+            </w:r>
+          </w:p>
+        </w:tc>
+        <w:tc>
+          <w:tcPr>
+            <w:tcW w:type="dxa" w:w="2835"/>
+          </w:tcPr>
+          <w:p>
+            <w:r/>
+            <w:r>
+              <w:rPr>
+                <w:sz w:val="20"/>
+              </w:rPr>
+              <w:t>Rp15.000 – 25.000 per porsi</w:t>
+            </w:r>
+          </w:p>
+        </w:tc>
+        <w:tc>
+          <w:tcPr>
+            <w:tcW w:type="dxa" w:w="3685"/>
+          </w:tcPr>
+          <w:p>
+            <w:r/>
+            <w:r>
+              <w:rPr>
+                <w:sz w:val="20"/>
+              </w:rPr>
+              <w:t>Di Bogor (dekat Puncak/wisata) &amp; Karawang (area industri) cenderung lebih mahal</w:t>
+            </w:r>
+          </w:p>
+        </w:tc>
+      </w:tr>
+      <w:tr>
+        <w:tc>
+          <w:tcPr>
+            <w:tcW w:type="dxa" w:w="2551"/>
+          </w:tcPr>
+          <w:p>
+            <w:r/>
+            <w:r>
+              <w:rPr>
+                <w:sz w:val="20"/>
+              </w:rPr>
+              <w:t>Masak sendiri (patungan)</w:t>
+            </w:r>
+          </w:p>
+        </w:tc>
+        <w:tc>
+          <w:tcPr>
+            <w:tcW w:type="dxa" w:w="2835"/>
+          </w:tcPr>
+          <w:p>
+            <w:r/>
+            <w:r>
+              <w:rPr>
+                <w:sz w:val="20"/>
+              </w:rPr>
+              <w:t>± Rp20.000 – 30.000 per orang/hari</w:t>
+            </w:r>
+          </w:p>
+        </w:tc>
+        <w:tc>
+          <w:tcPr>
+            <w:tcW w:type="dxa" w:w="3685"/>
+          </w:tcPr>
+          <w:p>
+            <w:r/>
+            <w:r>
+              <w:rPr>
+                <w:sz w:val="20"/>
+              </w:rPr>
+              <w:t>3x makan, beli bahan bersama di pasar desa</w:t>
+            </w:r>
+          </w:p>
+        </w:tc>
+      </w:tr>
+    </w:tbl>
+    <w:p/>
+    <w:tbl>
+      <w:tblPr>
+        <w:tblStyle w:val="TableGrid"/>
+        <w:tblW w:type="auto" w:w="0"/>
+        <w:jc w:val="center"/>
+        <w:tblLook w:firstColumn="1" w:firstRow="1" w:lastColumn="0" w:lastRow="0" w:noHBand="0" w:noVBand="1" w:val="04A0"/>
+      </w:tblPr>
+      <w:tblGrid>
+        <w:gridCol w:w="2436"/>
+        <w:gridCol w:w="2436"/>
+        <w:gridCol w:w="2436"/>
+        <w:gridCol w:w="2436"/>
+      </w:tblGrid>
+      <w:tr>
+        <w:tc>
+          <w:tcPr>
+            <w:tcW w:type="dxa" w:w="2835"/>
+            <w:shd w:val="clear" w:color="auto" w:fill="1F3A5F"/>
+          </w:tcPr>
+          <w:p>
+            <w:r/>
+            <w:r>
+              <w:rPr>
+                <w:b/>
+                <w:color w:val="FFFFFF"/>
+                <w:sz w:val="20"/>
+              </w:rPr>
+              <w:t>Skenario (± 30–40 hari KKM)</w:t>
+            </w:r>
+          </w:p>
+        </w:tc>
+        <w:tc>
+          <w:tcPr>
+            <w:tcW w:type="dxa" w:w="1984"/>
+            <w:shd w:val="clear" w:color="auto" w:fill="1F3A5F"/>
+          </w:tcPr>
+          <w:p>
+            <w:r/>
+            <w:r>
+              <w:rPr>
+                <w:b/>
+                <w:color w:val="FFFFFF"/>
+                <w:sz w:val="20"/>
+              </w:rPr>
+              <w:t>Per orang/hari</w:t>
+            </w:r>
+          </w:p>
+        </w:tc>
+        <w:tc>
+          <w:tcPr>
+            <w:tcW w:type="dxa" w:w="2268"/>
+            <w:shd w:val="clear" w:color="auto" w:fill="1F3A5F"/>
+          </w:tcPr>
+          <w:p>
+            <w:r/>
+            <w:r>
+              <w:rPr>
+                <w:b/>
+                <w:color w:val="FFFFFF"/>
+                <w:sz w:val="20"/>
+              </w:rPr>
+              <w:t>Per orang total</w:t>
+            </w:r>
+          </w:p>
+        </w:tc>
+        <w:tc>
+          <w:tcPr>
+            <w:tcW w:type="dxa" w:w="1984"/>
+            <w:shd w:val="clear" w:color="auto" w:fill="1F3A5F"/>
+          </w:tcPr>
+          <w:p>
+            <w:r/>
+            <w:r>
+              <w:rPr>
+                <w:b/>
+                <w:color w:val="FFFFFF"/>
+                <w:sz w:val="20"/>
+              </w:rPr>
+              <w:t>Kelompok 15 orang</w:t>
+            </w:r>
+          </w:p>
+        </w:tc>
+      </w:tr>
+      <w:tr>
+        <w:tc>
+          <w:tcPr>
+            <w:tcW w:type="dxa" w:w="2835"/>
+          </w:tcPr>
+          <w:p>
+            <w:r/>
+            <w:r>
+              <w:rPr>
+                <w:sz w:val="20"/>
+              </w:rPr>
+              <w:t>Masak sendiri (disarankan)</w:t>
+            </w:r>
+          </w:p>
+        </w:tc>
+        <w:tc>
+          <w:tcPr>
+            <w:tcW w:type="dxa" w:w="1984"/>
+          </w:tcPr>
+          <w:p>
+            <w:r/>
+            <w:r>
+              <w:rPr>
+                <w:sz w:val="20"/>
+              </w:rPr>
+              <w:t>Rp25.000</w:t>
+            </w:r>
+          </w:p>
+        </w:tc>
+        <w:tc>
+          <w:tcPr>
+            <w:tcW w:type="dxa" w:w="2268"/>
+          </w:tcPr>
+          <w:p>
+            <w:r/>
+            <w:r>
+              <w:rPr>
+                <w:sz w:val="20"/>
+              </w:rPr>
+              <w:t>Rp750.000 – 1.000.000</w:t>
+            </w:r>
+          </w:p>
+        </w:tc>
+        <w:tc>
+          <w:tcPr>
+            <w:tcW w:type="dxa" w:w="1984"/>
+          </w:tcPr>
+          <w:p>
+            <w:r/>
+            <w:r>
+              <w:rPr>
+                <w:sz w:val="20"/>
+              </w:rPr>
+              <w:t>Rp11 – 15 juta</w:t>
+            </w:r>
+          </w:p>
+        </w:tc>
+      </w:tr>
+      <w:tr>
+        <w:tc>
+          <w:tcPr>
+            <w:tcW w:type="dxa" w:w="2835"/>
+          </w:tcPr>
+          <w:p>
+            <w:r/>
+            <w:r>
+              <w:rPr>
+                <w:sz w:val="20"/>
+              </w:rPr>
+              <w:t>Campur (masak + beli)</w:t>
+            </w:r>
+          </w:p>
+        </w:tc>
+        <w:tc>
+          <w:tcPr>
+            <w:tcW w:type="dxa" w:w="1984"/>
+          </w:tcPr>
+          <w:p>
+            <w:r/>
+            <w:r>
+              <w:rPr>
+                <w:sz w:val="20"/>
+              </w:rPr>
+              <w:t>Rp35.000</w:t>
+            </w:r>
+          </w:p>
+        </w:tc>
+        <w:tc>
+          <w:tcPr>
+            <w:tcW w:type="dxa" w:w="2268"/>
+          </w:tcPr>
+          <w:p>
+            <w:r/>
+            <w:r>
+              <w:rPr>
+                <w:sz w:val="20"/>
+              </w:rPr>
+              <w:t>Rp1,05 – 1,4 juta</w:t>
+            </w:r>
+          </w:p>
+        </w:tc>
+        <w:tc>
+          <w:tcPr>
+            <w:tcW w:type="dxa" w:w="1984"/>
+          </w:tcPr>
+          <w:p>
+            <w:r/>
+            <w:r>
+              <w:rPr>
+                <w:sz w:val="20"/>
+              </w:rPr>
+              <w:t>Rp16 – 21 juta</w:t>
+            </w:r>
+          </w:p>
+        </w:tc>
+      </w:tr>
+      <w:tr>
+        <w:tc>
+          <w:tcPr>
+            <w:tcW w:type="dxa" w:w="2835"/>
+          </w:tcPr>
+          <w:p>
+            <w:r/>
+            <w:r>
+              <w:rPr>
+                <w:sz w:val="20"/>
+              </w:rPr>
+              <w:t>Beli terus (warteg)</w:t>
+            </w:r>
+          </w:p>
+        </w:tc>
+        <w:tc>
+          <w:tcPr>
+            <w:tcW w:type="dxa" w:w="1984"/>
+          </w:tcPr>
+          <w:p>
+            <w:r/>
+            <w:r>
+              <w:rPr>
+                <w:sz w:val="20"/>
+              </w:rPr>
+              <w:t>Rp50.000 – 60.000</w:t>
+            </w:r>
+          </w:p>
+        </w:tc>
+        <w:tc>
+          <w:tcPr>
+            <w:tcW w:type="dxa" w:w="2268"/>
+          </w:tcPr>
+          <w:p>
+            <w:r/>
+            <w:r>
+              <w:rPr>
+                <w:sz w:val="20"/>
+              </w:rPr>
+              <w:t>Rp1,5 – 2,4 juta</w:t>
+            </w:r>
+          </w:p>
+        </w:tc>
+        <w:tc>
+          <w:tcPr>
+            <w:tcW w:type="dxa" w:w="1984"/>
+          </w:tcPr>
+          <w:p>
+            <w:r/>
+            <w:r>
+              <w:rPr>
+                <w:sz w:val="20"/>
+              </w:rPr>
+              <w:t>Rp23 – 36 juta</w:t>
+            </w:r>
+          </w:p>
+        </w:tc>
+      </w:tr>
+    </w:tbl>
+    <w:p/>
+    <w:p>
+      <w:pPr>
+        <w:pStyle w:val="ListBullet"/>
+      </w:pPr>
+      <w:r>
+        <w:t>Bogor (pesantren): tinggal di asrama → hemat sewa; kemungkinan bisa kerja sama dapur/katering pesantren — tanyakan saat survei.</w:t>
       </w:r>
     </w:p>
     <w:p>
@@ -2193,7 +2845,7 @@
         <w:pStyle w:val="ListBullet"/>
       </w:pPr>
       <w:r>
-        <w:t>Biaya makan di sana diperkirakan lebih mahal dibanding Malang.</w:t>
+        <w:t>Karawang (desa): biaya tempat tinggal masih perlu di-follow up; harga di desa lebih murah dibanding pusat kota Karawang.</w:t>
       </w:r>
     </w:p>
     <w:p>
@@ -2201,7 +2853,7 @@
         <w:pStyle w:val="ListBullet"/>
       </w:pPr>
       <w:r>
-        <w:t>Hemat: beli beras bersama untuk semua anggota &amp; masak sendiri (jangan Indomie tiap hari 😄).</w:t>
+        <w:t>Hemat: beli beras &amp; bahan pokok grosir untuk semua anggota, jadwal piket masak, jangan Indomie tiap hari 😄.</w:t>
       </w:r>
     </w:p>
     <w:p>
@@ -2209,7 +2861,15 @@
         <w:pStyle w:val="ListBullet"/>
       </w:pPr>
       <w:r>
-        <w:t>Opsi katering desa bisa dipertimbangkan.</w:t>
+        <w:t>Belum termasuk: transportasi PP, bensin kendaraan, kebutuhan proker, dan iuran kelompok.</w:t>
+      </w:r>
+    </w:p>
+    <w:p>
+      <w:r>
+        <w:rPr>
+          <w:i/>
+        </w:rPr>
+        <w:t>Catatan: angka adalah estimasi dari data harga nasional/regional; pastikan dengan harga riil saat survei lokasi.</w:t>
       </w:r>
     </w:p>
     <w:p>
@@ -2947,7 +3607,7 @@
               <w:rPr>
                 <w:sz w:val="20"/>
               </w:rPr>
-              <w:t>Follow up Pak Afta (diskusi Senin)</w:t>
+              <w:t>Follow up Pak Okta (diskusi Senin)</w:t>
             </w:r>
           </w:p>
         </w:tc>
@@ -3251,7 +3911,7 @@
               <w:rPr>
                 <w:sz w:val="20"/>
               </w:rPr>
-              <w:t>Anggota (mis. Mas Gilang)</w:t>
+              <w:t>Anggota (mis. Gilang)</w:t>
             </w:r>
           </w:p>
         </w:tc>

</xml_diff>